<commit_message>
feat(report): restyle Word template to match the reference letter
Co-Authored-By: Claude Fable 5 <noreply@anthropic.com>
Claude-Session: https://claude.ai/code/session_01CgshPNds4yy9TCFjFn9FvF
</commit_message>
<xml_diff>
--- a/backend/templates/GSSG-GS_300-004_Report.docx
+++ b/backend/templates/GSSG-GS_300-004_Report.docx
@@ -6,31 +6,155 @@
       <w:pPr>
         <w:bidi/>
         <w:rPr>
-          <w:rFonts w:cstheme="minorHAnsi"/>
-          <w:i/>
-          <w:iCs/>
+          <w:rFonts w:eastAsia="Times New Roman" w:cs="Calibri"/>
           <w:sz w:val="32"/>
           <w:szCs w:val="32"/>
           <w:rtl/>
-          <w:lang w:bidi="ar-AE"/>
         </w:rPr>
       </w:pPr>
       <w:r>
         <w:rPr>
-          <w:rFonts w:cstheme="minorHAnsi" w:hint="cs"/>
-          <w:i/>
-          <w:iCs/>
+          <w:rFonts w:eastAsia="Times New Roman" w:cs="Calibri" w:hint="cs"/>
           <w:sz w:val="32"/>
           <w:szCs w:val="32"/>
           <w:rtl/>
-          <w:lang w:bidi="ar-AE"/>
-        </w:rPr>
-        <w:t>التاريخ: {{ date }}</w:t>
+        </w:rPr>
+        <w:t xml:space="preserve">التاريخ: {{ date }}</w:t>
       </w:r>
     </w:p>
     <w:p>
       <w:pPr>
         <w:bidi/>
+        <w:rPr>
+          <w:rFonts w:eastAsia="Times New Roman" w:cs="Calibri"/>
+          <w:sz w:val="32"/>
+          <w:szCs w:val="32"/>
+          <w:rtl/>
+        </w:rPr>
+      </w:pPr>
+    </w:p>
+    <w:p>
+      <w:pPr>
+        <w:tabs>
+          <w:tab w:val="left" w:pos="8789"/>
+        </w:tabs>
+        <w:bidi/>
+        <w:rPr>
+          <w:rFonts w:eastAsia="Times New Roman" w:cs="Calibri"/>
+          <w:sz w:val="32"/>
+          <w:szCs w:val="32"/>
+          <w:rtl/>
+        </w:rPr>
+      </w:pPr>
+      <w:r>
+        <w:rPr>
+          <w:rFonts w:eastAsia="Times New Roman" w:cs="Calibri" w:hint="cs"/>
+          <w:sz w:val="32"/>
+          <w:szCs w:val="32"/>
+          <w:rtl/>
+        </w:rPr>
+        <w:t xml:space="preserve">السيد {{ recipient_name }}</w:t>
+      </w:r>
+      <w:r>
+        <w:rPr>
+          <w:rFonts w:eastAsia="Times New Roman" w:cs="Calibri" w:hint="cs"/>
+          <w:sz w:val="32"/>
+          <w:szCs w:val="32"/>
+          <w:rtl/>
+        </w:rPr>
+        <w:tab/>
+        <w:t xml:space="preserve">المحترم </w:t>
+      </w:r>
+    </w:p>
+    <w:p>
+      <w:pPr>
+        <w:bidi/>
+        <w:rPr>
+          <w:rFonts w:eastAsia="Times New Roman" w:cs="Calibri"/>
+          <w:sz w:val="32"/>
+          <w:szCs w:val="32"/>
+          <w:rtl/>
+        </w:rPr>
+      </w:pPr>
+    </w:p>
+    <w:p>
+      <w:pPr>
+        <w:bidi/>
+        <w:rPr>
+          <w:rFonts w:eastAsia="Times New Roman" w:cs="Calibri"/>
+          <w:sz w:val="32"/>
+          <w:szCs w:val="32"/>
+          <w:rtl/>
+        </w:rPr>
+      </w:pPr>
+      <w:r>
+        <w:rPr>
+          <w:rFonts w:eastAsia="Times New Roman" w:cs="Calibri" w:hint="cs"/>
+          <w:sz w:val="32"/>
+          <w:szCs w:val="32"/>
+          <w:rtl/>
+        </w:rPr>
+        <w:t xml:space="preserve">تحية طيبة وبعد ,,</w:t>
+      </w:r>
+    </w:p>
+    <w:p>
+      <w:pPr>
+        <w:bidi/>
+        <w:rPr>
+          <w:rFonts w:eastAsia="Times New Roman" w:cs="Calibri"/>
+          <w:sz w:val="32"/>
+          <w:szCs w:val="32"/>
+          <w:rtl/>
+        </w:rPr>
+      </w:pPr>
+    </w:p>
+    <w:p>
+      <w:pPr>
+        <w:bidi/>
+        <w:jc w:val="center"/>
+        <w:rPr>
+          <w:rFonts w:eastAsia="Times New Roman" w:cs="Calibri"/>
+          <w:sz w:val="32"/>
+          <w:szCs w:val="32"/>
+          <w:rtl/>
+        </w:rPr>
+      </w:pPr>
+      <w:r>
+        <w:rPr>
+          <w:rFonts w:eastAsia="Times New Roman" w:cs="Calibri" w:hint="cs"/>
+          <w:sz w:val="32"/>
+          <w:szCs w:val="32"/>
+          <w:rtl/>
+        </w:rPr>
+        <w:t xml:space="preserve">{{ '' if not subject else 'الموضوع : ' ~ subject }}</w:t>
+      </w:r>
+    </w:p>
+    <w:p>
+      <w:pPr>
+        <w:bidi/>
+        <w:rPr>
+          <w:rFonts w:eastAsia="Times New Roman" w:cs="Calibri"/>
+          <w:sz w:val="32"/>
+          <w:szCs w:val="32"/>
+          <w:rtl/>
+        </w:rPr>
+      </w:pPr>
+    </w:p>
+    <w:p>
+      <w:pPr>
+        <w:bidi/>
+        <w:rPr>
+          <w:rFonts w:eastAsia="Times New Roman" w:cs="Calibri"/>
+          <w:sz w:val="32"/>
+          <w:szCs w:val="32"/>
+          <w:rtl/>
+        </w:rPr>
+      </w:pPr>
+    </w:p>
+    <w:p>
+      <w:pPr>
+        <w:bidi/>
+        <w:jc w:val="both"/>
         <w:rPr>
           <w:rFonts w:cstheme="minorHAnsi"/>
           <w:b/>
@@ -38,7 +162,6 @@
           <w:sz w:val="32"/>
           <w:szCs w:val="32"/>
           <w:rtl/>
-          <w:lang w:bidi="ar-AE"/>
         </w:rPr>
       </w:pPr>
       <w:r>
@@ -49,10 +172,34 @@
           <w:sz w:val="32"/>
           <w:szCs w:val="32"/>
           <w:rtl/>
-          <w:lang w:bidi="ar-AE"/>
-        </w:rPr>
-        <w:t xml:space="preserve">السيد \ </w:t>
+        </w:rPr>
+        <w:t>{{ body }}</w:t>
       </w:r>
+    </w:p>
+    <w:p>
+      <w:pPr>
+        <w:bidi/>
+        <w:rPr>
+          <w:rFonts w:eastAsia="Times New Roman" w:cs="Calibri"/>
+          <w:sz w:val="32"/>
+          <w:szCs w:val="32"/>
+          <w:rtl/>
+        </w:rPr>
+      </w:pPr>
+    </w:p>
+    <w:p>
+      <w:pPr>
+        <w:bidi/>
+        <w:jc w:val="both"/>
+        <w:rPr>
+          <w:rFonts w:cstheme="minorHAnsi"/>
+          <w:b/>
+          <w:bCs/>
+          <w:sz w:val="32"/>
+          <w:szCs w:val="32"/>
+          <w:rtl/>
+        </w:rPr>
+      </w:pPr>
       <w:r>
         <w:rPr>
           <w:rFonts w:cstheme="minorHAnsi" w:hint="cs"/>
@@ -61,10 +208,100 @@
           <w:sz w:val="32"/>
           <w:szCs w:val="32"/>
           <w:rtl/>
-          <w:lang w:bidi="ar-AE"/>
-        </w:rPr>
-        <w:t>{{ recipient_name }}</w:t>
+        </w:rPr>
+        <w:t>للتفضل بالعلم وإجراءاتكم لطفاً،،،</w:t>
       </w:r>
+    </w:p>
+    <w:p>
+      <w:pPr>
+        <w:bidi/>
+        <w:rPr>
+          <w:rFonts w:eastAsia="Times New Roman" w:cs="Calibri"/>
+          <w:sz w:val="32"/>
+          <w:szCs w:val="32"/>
+          <w:rtl/>
+        </w:rPr>
+      </w:pPr>
+    </w:p>
+    <w:p>
+      <w:pPr>
+        <w:bidi/>
+        <w:rPr>
+          <w:rFonts w:eastAsia="Times New Roman" w:cs="Calibri"/>
+          <w:sz w:val="32"/>
+          <w:szCs w:val="32"/>
+          <w:rtl/>
+        </w:rPr>
+      </w:pPr>
+    </w:p>
+    <w:p>
+      <w:pPr>
+        <w:bidi/>
+        <w:rPr>
+          <w:rFonts w:eastAsia="Times New Roman" w:cs="Calibri"/>
+          <w:sz w:val="32"/>
+          <w:szCs w:val="32"/>
+          <w:rtl/>
+        </w:rPr>
+      </w:pPr>
+    </w:p>
+    <w:p>
+      <w:pPr>
+        <w:bidi/>
+        <w:rPr>
+          <w:rFonts w:eastAsia="Times New Roman" w:cs="Calibri"/>
+          <w:sz w:val="32"/>
+          <w:szCs w:val="32"/>
+          <w:rtl/>
+        </w:rPr>
+      </w:pPr>
+    </w:p>
+    <w:p>
+      <w:pPr>
+        <w:bidi/>
+        <w:rPr>
+          <w:rFonts w:eastAsia="Times New Roman" w:cs="Calibri"/>
+          <w:sz w:val="32"/>
+          <w:szCs w:val="32"/>
+          <w:rtl/>
+        </w:rPr>
+      </w:pPr>
+    </w:p>
+    <w:p>
+      <w:pPr>
+        <w:bidi/>
+        <w:rPr>
+          <w:rFonts w:eastAsia="Times New Roman" w:cs="Calibri"/>
+          <w:sz w:val="32"/>
+          <w:szCs w:val="32"/>
+          <w:rtl/>
+        </w:rPr>
+      </w:pPr>
+    </w:p>
+    <w:p>
+      <w:pPr>
+        <w:bidi/>
+        <w:rPr>
+          <w:rFonts w:eastAsia="Times New Roman" w:cs="Calibri"/>
+          <w:sz w:val="32"/>
+          <w:szCs w:val="32"/>
+          <w:rtl/>
+        </w:rPr>
+      </w:pPr>
+    </w:p>
+    <w:p>
+      <w:pPr>
+        <w:bidi/>
+        <w:jc w:val="center"/>
+        <w:rPr>
+          <w:rFonts w:cstheme="minorHAnsi"/>
+          <w:b/>
+          <w:bCs/>
+          <w:sz w:val="32"/>
+          <w:szCs w:val="32"/>
+          <w:rtl/>
+        </w:rPr>
+      </w:pPr>
       <w:r>
         <w:rPr>
           <w:rFonts w:cstheme="minorHAnsi" w:hint="cs"/>
@@ -73,22 +310,117 @@
           <w:sz w:val="32"/>
           <w:szCs w:val="32"/>
           <w:rtl/>
-          <w:lang w:bidi="ar-AE"/>
-        </w:rPr>
-        <w:t xml:space="preserve"> المحترم </w:t>
+        </w:rPr>
+        <w:t>وتفضلوا بقبول فائق الإحترام والتقدير ,,,</w:t>
       </w:r>
     </w:p>
     <w:p>
       <w:pPr>
         <w:bidi/>
         <w:rPr>
-          <w:rFonts w:cstheme="minorHAnsi"/>
-          <w:b/>
-          <w:bCs/>
+          <w:rFonts w:eastAsia="Times New Roman" w:cs="Calibri"/>
           <w:sz w:val="32"/>
           <w:szCs w:val="32"/>
           <w:rtl/>
-          <w:lang w:bidi="ar-AE"/>
+        </w:rPr>
+      </w:pPr>
+    </w:p>
+    <w:p>
+      <w:pPr>
+        <w:bidi/>
+        <w:rPr>
+          <w:rFonts w:eastAsia="Times New Roman" w:cs="Calibri"/>
+          <w:sz w:val="32"/>
+          <w:szCs w:val="32"/>
+          <w:rtl/>
+        </w:rPr>
+      </w:pPr>
+    </w:p>
+    <w:p>
+      <w:pPr>
+        <w:bidi/>
+        <w:rPr>
+          <w:rFonts w:eastAsia="Times New Roman" w:cs="Calibri"/>
+          <w:sz w:val="32"/>
+          <w:szCs w:val="32"/>
+          <w:rtl/>
+        </w:rPr>
+      </w:pPr>
+    </w:p>
+    <w:p>
+      <w:pPr>
+        <w:bidi/>
+        <w:rPr>
+          <w:rFonts w:eastAsia="Times New Roman" w:cs="Calibri"/>
+          <w:sz w:val="32"/>
+          <w:szCs w:val="32"/>
+          <w:rtl/>
+        </w:rPr>
+      </w:pPr>
+    </w:p>
+    <w:p>
+      <w:pPr>
+        <w:bidi/>
+        <w:rPr>
+          <w:rFonts w:eastAsia="Times New Roman" w:cs="Calibri"/>
+          <w:sz w:val="32"/>
+          <w:szCs w:val="32"/>
+          <w:rtl/>
+        </w:rPr>
+      </w:pPr>
+    </w:p>
+    <w:p>
+      <w:pPr>
+        <w:bidi/>
+        <w:rPr>
+          <w:rFonts w:eastAsia="Times New Roman" w:cs="Calibri"/>
+          <w:sz w:val="32"/>
+          <w:szCs w:val="32"/>
+          <w:rtl/>
+        </w:rPr>
+      </w:pPr>
+    </w:p>
+    <w:p>
+      <w:pPr>
+        <w:bidi/>
+        <w:rPr>
+          <w:rFonts w:eastAsia="Times New Roman" w:cs="Calibri"/>
+          <w:sz w:val="32"/>
+          <w:szCs w:val="32"/>
+          <w:rtl/>
+        </w:rPr>
+      </w:pPr>
+    </w:p>
+    <w:p>
+      <w:pPr>
+        <w:bidi/>
+        <w:rPr>
+          <w:rFonts w:eastAsia="Times New Roman" w:cs="Calibri"/>
+          <w:sz w:val="32"/>
+          <w:szCs w:val="32"/>
+          <w:rtl/>
+        </w:rPr>
+      </w:pPr>
+    </w:p>
+    <w:p>
+      <w:pPr>
+        <w:bidi/>
+        <w:rPr>
+          <w:rFonts w:eastAsia="Times New Roman" w:cs="Calibri"/>
+          <w:sz w:val="32"/>
+          <w:szCs w:val="32"/>
+          <w:rtl/>
+        </w:rPr>
+      </w:pPr>
+    </w:p>
+    <w:p>
+      <w:pPr>
+        <w:bidi/>
+        <w:rPr>
+          <w:rFonts w:eastAsia="Times New Roman" w:cs="Calibri" w:hint="cs"/>
+          <w:sz w:val="36"/>
+          <w:szCs w:val="36"/>
+          <w:rtl/>
         </w:rPr>
       </w:pPr>
       <w:r>
@@ -96,342 +428,86 @@
           <w:rFonts w:cstheme="minorHAnsi" w:hint="cs"/>
           <w:b/>
           <w:bCs/>
+          <w:i/>
+          <w:iCs/>
           <w:sz w:val="32"/>
           <w:szCs w:val="32"/>
           <w:rtl/>
           <w:lang w:bidi="ar-AE"/>
         </w:rPr>
-        <w:t xml:space="preserve">        تحية طيبة </w:t>
+        <w:t xml:space="preserve">                                                                         </w:t>
       </w:r>
       <w:r>
         <w:rPr>
-          <w:rFonts w:cstheme="minorHAnsi" w:hint="cs"/>
-          <w:b/>
-          <w:bCs/>
-          <w:sz w:val="32"/>
-          <w:szCs w:val="32"/>
-          <w:rtl/>
-          <w:lang w:bidi="ar-AE"/>
-        </w:rPr>
-        <w:t>وبعد،</w:t>
-      </w:r>
-      <w:r>
-        <w:rPr>
-          <w:rFonts w:cstheme="minorHAnsi" w:hint="cs"/>
-          <w:b/>
-          <w:bCs/>
-          <w:sz w:val="32"/>
-          <w:szCs w:val="32"/>
-          <w:rtl/>
-          <w:lang w:bidi="ar-AE"/>
-        </w:rPr>
-        <w:t xml:space="preserve"> </w:t>
+          <w:rFonts w:eastAsia="Times New Roman" w:cs="Calibri" w:hint="cs"/>
+          <w:sz w:val="36"/>
+          <w:szCs w:val="36"/>
+          <w:rtl/>
+        </w:rPr>
+        <w:t xml:space="preserve">الإســـــــــــــــــــــــــــــــــــــــــــــــــــــــــــــــــــــــــــم : {{ manager_name }}  </w:t>
       </w:r>
     </w:p>
     <w:p>
       <w:pPr>
         <w:bidi/>
-        <w:rPr>
-          <w:rFonts w:cstheme="minorHAnsi"/>
-          <w:b/>
-          <w:bCs/>
-          <w:sz w:val="32"/>
-          <w:szCs w:val="32"/>
-          <w:rtl/>
-          <w:lang w:bidi="ar-AE"/>
+        <w:jc w:val="both"/>
+        <w:rPr>
+          <w:rFonts w:eastAsia="Times New Roman" w:cs="Calibri" w:hint="cs"/>
+          <w:sz w:val="36"/>
+          <w:szCs w:val="36"/>
+          <w:rtl/>
         </w:rPr>
       </w:pPr>
       <w:r>
         <w:rPr>
-          <w:rFonts w:cstheme="minorHAnsi" w:hint="cs"/>
-          <w:b/>
-          <w:bCs/>
-          <w:sz w:val="32"/>
-          <w:szCs w:val="32"/>
-          <w:rtl/>
-          <w:lang w:bidi="ar-AE"/>
-        </w:rPr>
-        <w:t xml:space="preserve">            </w:t>
+          <w:rFonts w:eastAsia="Times New Roman" w:cs="Calibri" w:hint="cs"/>
+          <w:sz w:val="36"/>
+          <w:szCs w:val="36"/>
+          <w:rtl/>
+        </w:rPr>
+        <w:t xml:space="preserve">                                                                  </w:t>
+      </w:r>
+      <w:r>
+        <w:rPr>
+          <w:rFonts w:eastAsia="Times New Roman" w:cs="Calibri" w:hint="cs"/>
+          <w:sz w:val="36"/>
+          <w:szCs w:val="36"/>
+          <w:rtl/>
+        </w:rPr>
+        <w:t xml:space="preserve">المسمى الوظيفي : {{ manager_title }} </w:t>
       </w:r>
     </w:p>
     <w:p>
       <w:pPr>
         <w:bidi/>
-        <w:jc w:val="right"/>
-        <w:rPr>
-          <w:rFonts w:cstheme="minorHAnsi"/>
-          <w:b/>
-          <w:bCs/>
-          <w:sz w:val="32"/>
-          <w:szCs w:val="32"/>
-          <w:rtl/>
-          <w:lang w:bidi="ar-AE"/>
+        <w:ind w:left="4680"/>
+        <w:rPr>
+          <w:rFonts w:eastAsia="Times New Roman" w:cs="Calibri" w:hint="cs"/>
+          <w:sz w:val="36"/>
+          <w:szCs w:val="36"/>
+          <w:rtl/>
         </w:rPr>
       </w:pPr>
       <w:r>
         <w:rPr>
-          <w:rFonts w:cstheme="minorHAnsi" w:hint="cs"/>
-          <w:b/>
-          <w:bCs/>
-          <w:sz w:val="32"/>
-          <w:szCs w:val="32"/>
-          <w:u w:val="single"/>
-          <w:rtl/>
-          <w:lang w:bidi="ar-AE"/>
-        </w:rPr>
-        <w:t>{{ '' if not subject else 'الموضوع: ' ~ subject }}</w:t>
+          <w:rFonts w:eastAsia="Times New Roman" w:cs="Calibri" w:hint="cs"/>
+          <w:sz w:val="36"/>
+          <w:szCs w:val="36"/>
+          <w:rtl/>
+        </w:rPr>
+        <w:t xml:space="preserve">       التوقيـــــــــــــــــــــــــــــــــــــــــــــــــــــــــــــــــــــع: {{ manager_sig }}</w:t>
       </w:r>
     </w:p>
     <w:p>
       <w:pPr>
-        <w:pStyle w:val="ListParagraph"/>
         <w:bidi/>
         <w:rPr>
-          <w:rFonts w:cstheme="minorHAnsi"/>
-          <w:b/>
-          <w:bCs/>
-          <w:u w:val="single"/>
-          <w:lang w:bidi="ar-AE"/>
-        </w:rPr>
-      </w:pPr>
-    </w:p>
-    <w:p>
-      <w:pPr>
-        <w:pStyle w:val="ListParagraph"/>
-        <w:bidi/>
-        <w:rPr>
-          <w:rFonts w:cstheme="minorHAnsi"/>
-          <w:b/>
-          <w:bCs/>
-          <w:sz w:val="28"/>
-          <w:szCs w:val="28"/>
-          <w:rtl/>
-          <w:lang w:bidi="ar-AE"/>
-        </w:rPr>
-      </w:pPr>
-      <w:r>
-        <w:rPr>
-          <w:rFonts w:cstheme="minorHAnsi" w:hint="cs"/>
-          <w:b/>
-          <w:bCs/>
-          <w:sz w:val="28"/>
-          <w:szCs w:val="28"/>
-          <w:rtl/>
-          <w:lang w:bidi="ar-AE"/>
-        </w:rPr>
-        <w:t>{{ body }}</w:t>
-      </w:r>
-    </w:p>
-    <w:p>
-      <w:pPr>
-        <w:pStyle w:val="ListParagraph"/>
-        <w:bidi/>
-        <w:rPr>
-          <w:rFonts w:cstheme="minorHAnsi"/>
-          <w:b/>
-          <w:bCs/>
-          <w:sz w:val="28"/>
-          <w:szCs w:val="28"/>
-          <w:rtl/>
-          <w:lang w:bidi="ar-AE"/>
-        </w:rPr>
-      </w:pPr>
-    </w:p>
-    <w:p>
-      <w:pPr>
-        <w:pStyle w:val="ListParagraph"/>
-        <w:keepNext/>
-        <w:bidi/>
-        <w:rPr>
-          <w:rFonts w:cstheme="minorHAnsi"/>
-          <w:b/>
-          <w:bCs/>
+          <w:rFonts w:eastAsia="Times New Roman" w:cs="Calibri"/>
           <w:sz w:val="32"/>
           <w:szCs w:val="32"/>
-          <w:lang w:bidi="ar-AE"/>
-        </w:rPr>
-      </w:pPr>
-      <w:r>
-        <w:rPr>
-          <w:rFonts w:cstheme="minorHAnsi" w:hint="cs"/>
-          <w:b/>
-          <w:bCs/>
-          <w:sz w:val="32"/>
-          <w:szCs w:val="32"/>
-          <w:rtl/>
-          <w:lang w:bidi="ar-AE"/>
-        </w:rPr>
-        <w:t>للتفضل بالعلم وإجراءاتكم لطفاً،،،</w:t>
-      </w:r>
-    </w:p>
-    <w:p>
-      <w:pPr>
-        <w:keepNext/>
-        <w:bidi/>
-        <w:jc w:val="right"/>
-        <w:rPr>
-          <w:rFonts w:cstheme="minorHAnsi"/>
-          <w:b/>
-          <w:bCs/>
-          <w:rtl/>
-          <w:lang w:bidi="ar-AE"/>
-        </w:rPr>
-      </w:pPr>
-      <w:r>
-        <w:t>وتفضلوا بقبول فائق الاحترام والتقدير،،،</w:t>
-      </w:r>
-    </w:p>
-    <w:p>
-      <w:pPr>
-        <w:keepNext/>
-        <w:bidi/>
-        <w:ind w:left="6480"/>
-        <w:jc w:val="right"/>
-        <w:rPr>
-          <w:rFonts w:cstheme="minorHAnsi"/>
-          <w:b/>
-          <w:bCs/>
-          <w:sz w:val="28"/>
-          <w:szCs w:val="28"/>
-          <w:rtl/>
-          <w:lang w:bidi="ar-AE"/>
-        </w:rPr>
-      </w:pPr>
-      <w:r>
-        <w:t>الاسم: {{ manager_name }}</w:t>
-      </w:r>
-    </w:p>
-    <w:p>
-      <w:pPr>
-        <w:keepNext/>
-        <w:bidi/>
-        <w:ind w:left="6480"/>
-        <w:jc w:val="right"/>
-        <w:rPr>
-          <w:rFonts w:cstheme="minorHAnsi"/>
-          <w:b/>
-          <w:bCs/>
-          <w:sz w:val="28"/>
-          <w:szCs w:val="28"/>
-          <w:rtl/>
-          <w:lang w:bidi="ar-AE"/>
-        </w:rPr>
-      </w:pPr>
-      <w:r>
-        <w:rPr>
-          <w:rFonts w:cstheme="minorHAnsi" w:hint="cs"/>
-          <w:b/>
-          <w:bCs/>
-          <w:sz w:val="28"/>
-          <w:szCs w:val="28"/>
-          <w:rtl/>
-          <w:lang w:bidi="ar-AE"/>
-        </w:rPr>
-        <w:t>المسمى الوظيفي: {{ manager_title }}</w:t>
-      </w:r>
-    </w:p>
-    <w:p>
-      <w:pPr>
-        <w:bidi/>
-        <w:ind w:left="5760"/>
-        <w:jc w:val="right"/>
-        <w:rPr>
-          <w:rFonts w:cstheme="minorHAnsi"/>
-          <w:b/>
-          <w:bCs/>
-          <w:sz w:val="28"/>
-          <w:szCs w:val="28"/>
-          <w:rtl/>
-          <w:lang w:bidi="ar-AE"/>
-        </w:rPr>
-      </w:pPr>
-      <w:r>
-        <w:rPr>
-          <w:rFonts w:cstheme="minorHAnsi" w:hint="cs"/>
-          <w:b/>
-          <w:bCs/>
-          <w:sz w:val="28"/>
-          <w:szCs w:val="28"/>
-          <w:rtl/>
-          <w:lang w:bidi="ar-AE"/>
-        </w:rPr>
-        <w:t>التوقيع: {{ manager_sig }}</w:t>
-      </w:r>
-    </w:p>
-    <w:p>
-      <w:pPr>
-        <w:pStyle w:val="ListParagraph"/>
-        <w:bidi/>
-        <w:rPr>
-          <w:rFonts w:cstheme="minorHAnsi"/>
-          <w:b/>
-          <w:bCs/>
-          <w:sz w:val="32"/>
-          <w:szCs w:val="32"/>
-          <w:lang w:bidi="ar-AE"/>
-        </w:rPr>
-      </w:pPr>
-      <w:r>
-        <w:rPr>
-          <w:rFonts w:cstheme="minorHAnsi" w:hint="cs"/>
-          <w:b/>
-          <w:bCs/>
-          <w:sz w:val="32"/>
-          <w:szCs w:val="32"/>
-          <w:rtl/>
-          <w:lang w:bidi="ar-AE"/>
-        </w:rPr>
-        <w:t>{%p if cc %}</w:t>
-      </w:r>
-    </w:p>
-    <w:p>
-      <w:pPr>
-        <w:pStyle w:val="ListParagraph"/>
-        <w:bidi/>
-        <w:jc w:val="right"/>
-        <w:rPr>
-          <w:rFonts w:cstheme="minorHAnsi"/>
-          <w:sz w:val="20"/>
-          <w:szCs w:val="20"/>
-          <w:lang w:bidi="ar-AE"/>
-        </w:rPr>
-      </w:pPr>
-      <w:r>
-        <w:rPr>
-          <w:rFonts w:cstheme="minorHAnsi" w:hint="cs"/>
-          <w:sz w:val="20"/>
-          <w:szCs w:val="20"/>
-          <w:rtl/>
-          <w:lang w:bidi="ar-AE"/>
-        </w:rPr>
-        <w:t>نسخة إلى: {{ cc }}</w:t>
-      </w:r>
-    </w:p>
-    <w:p>
-      <w:pPr>
-        <w:pStyle w:val="ListParagraph"/>
-        <w:bidi/>
-        <w:rPr>
-          <w:rFonts w:cstheme="minorHAnsi"/>
-          <w:b/>
-          <w:bCs/>
-          <w:sz w:val="32"/>
-          <w:szCs w:val="32"/>
-          <w:lang w:bidi="ar-AE"/>
-        </w:rPr>
-      </w:pPr>
-      <w:r>
-        <w:rPr>
-          <w:rFonts w:cstheme="minorHAnsi" w:hint="cs"/>
-          <w:b/>
-          <w:bCs/>
-          <w:sz w:val="32"/>
-          <w:szCs w:val="32"/>
-          <w:rtl/>
-          <w:lang w:bidi="ar-AE"/>
-        </w:rPr>
-        <w:t>{%p endif %}</w:t>
-      </w:r>
+          <w:rtl/>
+        </w:rPr>
+      </w:pPr>
     </w:p>
     <w:sectPr>
       <w:headerReference w:type="default" r:id="rId8"/>

</xml_diff>

<commit_message>
fix(report): tighten closing gap to 2 blanks after visual QA
Operator reduced the للتفضل→وتفضلوا gap from the reference's 7 blank
lines to 2 so long bodies don't push the closing onto a second page.

Co-Authored-By: Claude Fable 5 <noreply@anthropic.com>
Claude-Session: https://claude.ai/code/session_01CgshPNds4yy9TCFjFn9FvF
</commit_message>
<xml_diff>
--- a/backend/templates/GSSG-GS_300-004_Report.docx
+++ b/backend/templates/GSSG-GS_300-004_Report.docx
@@ -211,61 +211,6 @@
         </w:rPr>
         <w:t>للتفضل بالعلم وإجراءاتكم لطفاً،،،</w:t>
       </w:r>
-    </w:p>
-    <w:p>
-      <w:pPr>
-        <w:bidi/>
-        <w:rPr>
-          <w:rFonts w:eastAsia="Times New Roman" w:cs="Calibri"/>
-          <w:sz w:val="32"/>
-          <w:szCs w:val="32"/>
-          <w:rtl/>
-        </w:rPr>
-      </w:pPr>
-    </w:p>
-    <w:p>
-      <w:pPr>
-        <w:bidi/>
-        <w:rPr>
-          <w:rFonts w:eastAsia="Times New Roman" w:cs="Calibri"/>
-          <w:sz w:val="32"/>
-          <w:szCs w:val="32"/>
-          <w:rtl/>
-        </w:rPr>
-      </w:pPr>
-    </w:p>
-    <w:p>
-      <w:pPr>
-        <w:bidi/>
-        <w:rPr>
-          <w:rFonts w:eastAsia="Times New Roman" w:cs="Calibri"/>
-          <w:sz w:val="32"/>
-          <w:szCs w:val="32"/>
-          <w:rtl/>
-        </w:rPr>
-      </w:pPr>
-    </w:p>
-    <w:p>
-      <w:pPr>
-        <w:bidi/>
-        <w:rPr>
-          <w:rFonts w:eastAsia="Times New Roman" w:cs="Calibri"/>
-          <w:sz w:val="32"/>
-          <w:szCs w:val="32"/>
-          <w:rtl/>
-        </w:rPr>
-      </w:pPr>
-    </w:p>
-    <w:p>
-      <w:pPr>
-        <w:bidi/>
-        <w:rPr>
-          <w:rFonts w:eastAsia="Times New Roman" w:cs="Calibri"/>
-          <w:sz w:val="32"/>
-          <w:szCs w:val="32"/>
-          <w:rtl/>
-        </w:rPr>
-      </w:pPr>
     </w:p>
     <w:p>
       <w:pPr>

</xml_diff>

<commit_message>
feat(report): Sakkal Majalla + operator punctuation/bold edits (round 2)
</commit_message>
<xml_diff>
--- a/backend/templates/GSSG-GS_300-004_Report.docx
+++ b/backend/templates/GSSG-GS_300-004_Report.docx
@@ -6,7 +6,7 @@
       <w:pPr>
         <w:bidi/>
         <w:rPr>
-          <w:rFonts w:eastAsia="Times New Roman" w:cs="Calibri"/>
+          <w:rFonts w:ascii="Sakkal Majalla" w:hAnsi="Sakkal Majalla" w:cs="Sakkal Majalla"/>
           <w:sz w:val="32"/>
           <w:szCs w:val="32"/>
           <w:rtl/>
@@ -14,7 +14,7 @@
       </w:pPr>
       <w:r>
         <w:rPr>
-          <w:rFonts w:eastAsia="Times New Roman" w:cs="Calibri" w:hint="cs"/>
+          <w:rFonts w:ascii="Sakkal Majalla" w:hAnsi="Sakkal Majalla" w:cs="Sakkal Majalla" w:hint="cs"/>
           <w:sz w:val="32"/>
           <w:szCs w:val="32"/>
           <w:rtl/>
@@ -26,7 +26,7 @@
       <w:pPr>
         <w:bidi/>
         <w:rPr>
-          <w:rFonts w:eastAsia="Times New Roman" w:cs="Calibri"/>
+          <w:rFonts w:ascii="Sakkal Majalla" w:hAnsi="Sakkal Majalla" w:cs="Sakkal Majalla"/>
           <w:sz w:val="32"/>
           <w:szCs w:val="32"/>
           <w:rtl/>
@@ -40,7 +40,7 @@
         </w:tabs>
         <w:bidi/>
         <w:rPr>
-          <w:rFonts w:eastAsia="Times New Roman" w:cs="Calibri"/>
+          <w:rFonts w:ascii="Sakkal Majalla" w:hAnsi="Sakkal Majalla" w:cs="Sakkal Majalla"/>
           <w:sz w:val="32"/>
           <w:szCs w:val="32"/>
           <w:rtl/>
@@ -48,7 +48,7 @@
       </w:pPr>
       <w:r>
         <w:rPr>
-          <w:rFonts w:eastAsia="Times New Roman" w:cs="Calibri" w:hint="cs"/>
+          <w:rFonts w:ascii="Sakkal Majalla" w:hAnsi="Sakkal Majalla" w:cs="Sakkal Majalla" w:hint="cs"/>
           <w:sz w:val="32"/>
           <w:szCs w:val="32"/>
           <w:rtl/>
@@ -57,7 +57,7 @@
       </w:r>
       <w:r>
         <w:rPr>
-          <w:rFonts w:eastAsia="Times New Roman" w:cs="Calibri" w:hint="cs"/>
+          <w:rFonts w:ascii="Sakkal Majalla" w:hAnsi="Sakkal Majalla" w:cs="Sakkal Majalla" w:hint="cs"/>
           <w:sz w:val="32"/>
           <w:szCs w:val="32"/>
           <w:rtl/>
@@ -70,7 +70,7 @@
       <w:pPr>
         <w:bidi/>
         <w:rPr>
-          <w:rFonts w:eastAsia="Times New Roman" w:cs="Calibri"/>
+          <w:rFonts w:ascii="Sakkal Majalla" w:hAnsi="Sakkal Majalla" w:cs="Sakkal Majalla"/>
           <w:sz w:val="32"/>
           <w:szCs w:val="32"/>
           <w:rtl/>
@@ -81,7 +81,7 @@
       <w:pPr>
         <w:bidi/>
         <w:rPr>
-          <w:rFonts w:eastAsia="Times New Roman" w:cs="Calibri"/>
+          <w:rFonts w:ascii="Sakkal Majalla" w:hAnsi="Sakkal Majalla" w:cs="Sakkal Majalla"/>
           <w:sz w:val="32"/>
           <w:szCs w:val="32"/>
           <w:rtl/>
@@ -89,19 +89,19 @@
       </w:pPr>
       <w:r>
         <w:rPr>
-          <w:rFonts w:eastAsia="Times New Roman" w:cs="Calibri" w:hint="cs"/>
+          <w:rFonts w:ascii="Sakkal Majalla" w:hAnsi="Sakkal Majalla" w:cs="Sakkal Majalla" w:hint="cs"/>
           <w:sz w:val="32"/>
           <w:szCs w:val="32"/>
           <w:rtl/>
         </w:rPr>
-        <w:t xml:space="preserve">تحية طيبة وبعد ,,</w:t>
+        <w:t xml:space="preserve">تحية طيبة وبعد ،،</w:t>
       </w:r>
     </w:p>
     <w:p>
       <w:pPr>
         <w:bidi/>
         <w:rPr>
-          <w:rFonts w:eastAsia="Times New Roman" w:cs="Calibri"/>
+          <w:rFonts w:ascii="Sakkal Majalla" w:hAnsi="Sakkal Majalla" w:cs="Sakkal Majalla"/>
           <w:sz w:val="32"/>
           <w:szCs w:val="32"/>
           <w:rtl/>
@@ -113,7 +113,7 @@
         <w:bidi/>
         <w:jc w:val="center"/>
         <w:rPr>
-          <w:rFonts w:eastAsia="Times New Roman" w:cs="Calibri"/>
+          <w:rFonts w:ascii="Sakkal Majalla" w:hAnsi="Sakkal Majalla" w:cs="Sakkal Majalla"/>
           <w:sz w:val="32"/>
           <w:szCs w:val="32"/>
           <w:rtl/>
@@ -121,7 +121,7 @@
       </w:pPr>
       <w:r>
         <w:rPr>
-          <w:rFonts w:eastAsia="Times New Roman" w:cs="Calibri" w:hint="cs"/>
+          <w:rFonts w:ascii="Sakkal Majalla" w:hAnsi="Sakkal Majalla" w:cs="Sakkal Majalla" w:hint="cs"/>
           <w:sz w:val="32"/>
           <w:szCs w:val="32"/>
           <w:rtl/>
@@ -133,7 +133,7 @@
       <w:pPr>
         <w:bidi/>
         <w:rPr>
-          <w:rFonts w:eastAsia="Times New Roman" w:cs="Calibri"/>
+          <w:rFonts w:ascii="Sakkal Majalla" w:hAnsi="Sakkal Majalla" w:cs="Sakkal Majalla"/>
           <w:sz w:val="32"/>
           <w:szCs w:val="32"/>
           <w:rtl/>
@@ -144,7 +144,7 @@
       <w:pPr>
         <w:bidi/>
         <w:rPr>
-          <w:rFonts w:eastAsia="Times New Roman" w:cs="Calibri"/>
+          <w:rFonts w:ascii="Sakkal Majalla" w:hAnsi="Sakkal Majalla" w:cs="Sakkal Majalla"/>
           <w:sz w:val="32"/>
           <w:szCs w:val="32"/>
           <w:rtl/>
@@ -156,7 +156,7 @@
         <w:bidi/>
         <w:jc w:val="both"/>
         <w:rPr>
-          <w:rFonts w:cstheme="minorHAnsi"/>
+          <w:rFonts w:ascii="Sakkal Majalla" w:hAnsi="Sakkal Majalla" w:cs="Sakkal Majalla"/>
           <w:b/>
           <w:bCs/>
           <w:sz w:val="32"/>
@@ -166,7 +166,7 @@
       </w:pPr>
       <w:r>
         <w:rPr>
-          <w:rFonts w:cstheme="minorHAnsi" w:hint="cs"/>
+          <w:rFonts w:ascii="Sakkal Majalla" w:hAnsi="Sakkal Majalla" w:cs="Sakkal Majalla" w:hint="cs"/>
           <w:b/>
           <w:bCs/>
           <w:sz w:val="32"/>
@@ -180,7 +180,7 @@
       <w:pPr>
         <w:bidi/>
         <w:rPr>
-          <w:rFonts w:eastAsia="Times New Roman" w:cs="Calibri"/>
+          <w:rFonts w:ascii="Sakkal Majalla" w:hAnsi="Sakkal Majalla" w:cs="Sakkal Majalla"/>
           <w:sz w:val="32"/>
           <w:szCs w:val="32"/>
           <w:rtl/>
@@ -192,9 +192,7 @@
         <w:bidi/>
         <w:jc w:val="both"/>
         <w:rPr>
-          <w:rFonts w:cstheme="minorHAnsi"/>
-          <w:b/>
-          <w:bCs/>
+          <w:rFonts w:ascii="Sakkal Majalla" w:hAnsi="Sakkal Majalla" w:cs="Sakkal Majalla"/>
           <w:sz w:val="32"/>
           <w:szCs w:val="32"/>
           <w:rtl/>
@@ -202,21 +200,19 @@
       </w:pPr>
       <w:r>
         <w:rPr>
-          <w:rFonts w:cstheme="minorHAnsi" w:hint="cs"/>
-          <w:b/>
-          <w:bCs/>
+          <w:rFonts w:ascii="Sakkal Majalla" w:hAnsi="Sakkal Majalla" w:cs="Sakkal Majalla" w:hint="cs"/>
           <w:sz w:val="32"/>
           <w:szCs w:val="32"/>
           <w:rtl/>
         </w:rPr>
-        <w:t>للتفضل بالعلم وإجراءاتكم لطفاً،،،</w:t>
+        <w:t>للتفضل بالعلم وإجراءاتكم لطفاً،،</w:t>
       </w:r>
     </w:p>
     <w:p>
       <w:pPr>
         <w:bidi/>
         <w:rPr>
-          <w:rFonts w:eastAsia="Times New Roman" w:cs="Calibri"/>
+          <w:rFonts w:ascii="Sakkal Majalla" w:hAnsi="Sakkal Majalla" w:cs="Sakkal Majalla"/>
           <w:sz w:val="32"/>
           <w:szCs w:val="32"/>
           <w:rtl/>
@@ -227,7 +223,7 @@
       <w:pPr>
         <w:bidi/>
         <w:rPr>
-          <w:rFonts w:eastAsia="Times New Roman" w:cs="Calibri"/>
+          <w:rFonts w:ascii="Sakkal Majalla" w:hAnsi="Sakkal Majalla" w:cs="Sakkal Majalla"/>
           <w:sz w:val="32"/>
           <w:szCs w:val="32"/>
           <w:rtl/>
@@ -239,9 +235,7 @@
         <w:bidi/>
         <w:jc w:val="center"/>
         <w:rPr>
-          <w:rFonts w:cstheme="minorHAnsi"/>
-          <w:b/>
-          <w:bCs/>
+          <w:rFonts w:ascii="Sakkal Majalla" w:hAnsi="Sakkal Majalla" w:cs="Sakkal Majalla"/>
           <w:sz w:val="32"/>
           <w:szCs w:val="32"/>
           <w:rtl/>
@@ -249,21 +243,19 @@
       </w:pPr>
       <w:r>
         <w:rPr>
-          <w:rFonts w:cstheme="minorHAnsi" w:hint="cs"/>
-          <w:b/>
-          <w:bCs/>
+          <w:rFonts w:ascii="Sakkal Majalla" w:hAnsi="Sakkal Majalla" w:cs="Sakkal Majalla" w:hint="cs"/>
           <w:sz w:val="32"/>
           <w:szCs w:val="32"/>
           <w:rtl/>
         </w:rPr>
-        <w:t>وتفضلوا بقبول فائق الإحترام والتقدير ,,,</w:t>
+        <w:t>وتفضلوا بقبول فائق الاحترام والتقدير</w:t>
       </w:r>
     </w:p>
     <w:p>
       <w:pPr>
         <w:bidi/>
         <w:rPr>
-          <w:rFonts w:eastAsia="Times New Roman" w:cs="Calibri"/>
+          <w:rFonts w:ascii="Sakkal Majalla" w:hAnsi="Sakkal Majalla" w:cs="Sakkal Majalla"/>
           <w:sz w:val="32"/>
           <w:szCs w:val="32"/>
           <w:rtl/>
@@ -274,7 +266,7 @@
       <w:pPr>
         <w:bidi/>
         <w:rPr>
-          <w:rFonts w:eastAsia="Times New Roman" w:cs="Calibri"/>
+          <w:rFonts w:ascii="Sakkal Majalla" w:hAnsi="Sakkal Majalla" w:cs="Sakkal Majalla"/>
           <w:sz w:val="32"/>
           <w:szCs w:val="32"/>
           <w:rtl/>
@@ -285,7 +277,7 @@
       <w:pPr>
         <w:bidi/>
         <w:rPr>
-          <w:rFonts w:eastAsia="Times New Roman" w:cs="Calibri"/>
+          <w:rFonts w:ascii="Sakkal Majalla" w:hAnsi="Sakkal Majalla" w:cs="Sakkal Majalla"/>
           <w:sz w:val="32"/>
           <w:szCs w:val="32"/>
           <w:rtl/>
@@ -296,7 +288,7 @@
       <w:pPr>
         <w:bidi/>
         <w:rPr>
-          <w:rFonts w:eastAsia="Times New Roman" w:cs="Calibri"/>
+          <w:rFonts w:ascii="Sakkal Majalla" w:hAnsi="Sakkal Majalla" w:cs="Sakkal Majalla"/>
           <w:sz w:val="32"/>
           <w:szCs w:val="32"/>
           <w:rtl/>
@@ -307,7 +299,7 @@
       <w:pPr>
         <w:bidi/>
         <w:rPr>
-          <w:rFonts w:eastAsia="Times New Roman" w:cs="Calibri"/>
+          <w:rFonts w:ascii="Sakkal Majalla" w:hAnsi="Sakkal Majalla" w:cs="Sakkal Majalla"/>
           <w:sz w:val="32"/>
           <w:szCs w:val="32"/>
           <w:rtl/>
@@ -318,7 +310,7 @@
       <w:pPr>
         <w:bidi/>
         <w:rPr>
-          <w:rFonts w:eastAsia="Times New Roman" w:cs="Calibri"/>
+          <w:rFonts w:ascii="Sakkal Majalla" w:hAnsi="Sakkal Majalla" w:cs="Sakkal Majalla"/>
           <w:sz w:val="32"/>
           <w:szCs w:val="32"/>
           <w:rtl/>
@@ -329,7 +321,7 @@
       <w:pPr>
         <w:bidi/>
         <w:rPr>
-          <w:rFonts w:eastAsia="Times New Roman" w:cs="Calibri"/>
+          <w:rFonts w:ascii="Sakkal Majalla" w:hAnsi="Sakkal Majalla" w:cs="Sakkal Majalla"/>
           <w:sz w:val="32"/>
           <w:szCs w:val="32"/>
           <w:rtl/>
@@ -340,7 +332,7 @@
       <w:pPr>
         <w:bidi/>
         <w:rPr>
-          <w:rFonts w:eastAsia="Times New Roman" w:cs="Calibri"/>
+          <w:rFonts w:ascii="Sakkal Majalla" w:hAnsi="Sakkal Majalla" w:cs="Sakkal Majalla"/>
           <w:sz w:val="32"/>
           <w:szCs w:val="32"/>
           <w:rtl/>
@@ -351,7 +343,7 @@
       <w:pPr>
         <w:bidi/>
         <w:rPr>
-          <w:rFonts w:eastAsia="Times New Roman" w:cs="Calibri"/>
+          <w:rFonts w:ascii="Sakkal Majalla" w:hAnsi="Sakkal Majalla" w:cs="Sakkal Majalla"/>
           <w:sz w:val="32"/>
           <w:szCs w:val="32"/>
           <w:rtl/>
@@ -362,7 +354,7 @@
       <w:pPr>
         <w:bidi/>
         <w:rPr>
-          <w:rFonts w:eastAsia="Times New Roman" w:cs="Calibri" w:hint="cs"/>
+          <w:rFonts w:ascii="Sakkal Majalla" w:hAnsi="Sakkal Majalla" w:cs="Sakkal Majalla" w:hint="cs"/>
           <w:sz w:val="36"/>
           <w:szCs w:val="36"/>
           <w:rtl/>
@@ -370,7 +362,7 @@
       </w:pPr>
       <w:r>
         <w:rPr>
-          <w:rFonts w:cstheme="minorHAnsi" w:hint="cs"/>
+          <w:rFonts w:ascii="Sakkal Majalla" w:hAnsi="Sakkal Majalla" w:cs="Sakkal Majalla" w:hint="cs"/>
           <w:b/>
           <w:bCs/>
           <w:i/>
@@ -384,7 +376,7 @@
       </w:r>
       <w:r>
         <w:rPr>
-          <w:rFonts w:eastAsia="Times New Roman" w:cs="Calibri" w:hint="cs"/>
+          <w:rFonts w:ascii="Sakkal Majalla" w:hAnsi="Sakkal Majalla" w:cs="Sakkal Majalla" w:hint="cs"/>
           <w:sz w:val="36"/>
           <w:szCs w:val="36"/>
           <w:rtl/>
@@ -397,7 +389,7 @@
         <w:bidi/>
         <w:jc w:val="both"/>
         <w:rPr>
-          <w:rFonts w:eastAsia="Times New Roman" w:cs="Calibri" w:hint="cs"/>
+          <w:rFonts w:ascii="Sakkal Majalla" w:hAnsi="Sakkal Majalla" w:cs="Sakkal Majalla" w:hint="cs"/>
           <w:sz w:val="36"/>
           <w:szCs w:val="36"/>
           <w:rtl/>
@@ -405,7 +397,7 @@
       </w:pPr>
       <w:r>
         <w:rPr>
-          <w:rFonts w:eastAsia="Times New Roman" w:cs="Calibri" w:hint="cs"/>
+          <w:rFonts w:ascii="Sakkal Majalla" w:hAnsi="Sakkal Majalla" w:cs="Sakkal Majalla" w:hint="cs"/>
           <w:sz w:val="36"/>
           <w:szCs w:val="36"/>
           <w:rtl/>
@@ -414,7 +406,7 @@
       </w:r>
       <w:r>
         <w:rPr>
-          <w:rFonts w:eastAsia="Times New Roman" w:cs="Calibri" w:hint="cs"/>
+          <w:rFonts w:ascii="Sakkal Majalla" w:hAnsi="Sakkal Majalla" w:cs="Sakkal Majalla" w:hint="cs"/>
           <w:sz w:val="36"/>
           <w:szCs w:val="36"/>
           <w:rtl/>
@@ -427,7 +419,7 @@
         <w:bidi/>
         <w:ind w:left="4680"/>
         <w:rPr>
-          <w:rFonts w:eastAsia="Times New Roman" w:cs="Calibri" w:hint="cs"/>
+          <w:rFonts w:ascii="Sakkal Majalla" w:hAnsi="Sakkal Majalla" w:cs="Sakkal Majalla" w:hint="cs"/>
           <w:sz w:val="36"/>
           <w:szCs w:val="36"/>
           <w:rtl/>
@@ -435,7 +427,7 @@
       </w:pPr>
       <w:r>
         <w:rPr>
-          <w:rFonts w:eastAsia="Times New Roman" w:cs="Calibri" w:hint="cs"/>
+          <w:rFonts w:ascii="Sakkal Majalla" w:hAnsi="Sakkal Majalla" w:cs="Sakkal Majalla" w:hint="cs"/>
           <w:sz w:val="36"/>
           <w:szCs w:val="36"/>
           <w:rtl/>
@@ -447,7 +439,7 @@
       <w:pPr>
         <w:bidi/>
         <w:rPr>
-          <w:rFonts w:eastAsia="Times New Roman" w:cs="Calibri"/>
+          <w:rFonts w:ascii="Sakkal Majalla" w:hAnsi="Sakkal Majalla" w:cs="Sakkal Majalla"/>
           <w:sz w:val="32"/>
           <w:szCs w:val="32"/>
           <w:rtl/>

</xml_diff>